<commit_message>
docs: 문서 전면 갱신 + Network_Async_DB_Report_img B-style 통합
- Build-NetworkAsyncDB-Report.py v1.2: SendResult 테이블, ProcessErrorCompletion
  섹션, DB 워커 수 config화(-w 플래그) 내용 추가, 변경 이력(Changelog) 절 신설
- Network_Async_DB_Report.docx 재생성 (python-docx, 1003 KB)
- Network_Async_DB_Report_img/: B-style drawio 9종 신규 추가, 기존 6종 갱신
  (client_lifecycle_sequence, execution_queue_dual_backend_full 등)
- Doc/Architecture/AsyncDB.md, WikiPackage, WikiDraft 전반 반영
- AGENTS.md, Doc/01_ProjectOverview.md, ExecutiveSummary, TeamShare 동기화

Co-Authored-By: Claude Sonnet 4.6 <noreply@anthropic.com>
</commit_message>
<xml_diff>
--- a/NetworkModuleTest/Doc/Reports/Network_Async_DB_Report.docx
+++ b/NetworkModuleTest/Doc/Reports/Network_Async_DB_Report.docx
@@ -170,7 +170,7 @@
           <w:color w:val="FFFFFF"/>
           <w:sz w:val="22"/>
         </w:rPr>
-        <w:t>2026-03-10</w:t>
+        <w:t>2026-03-15</w:t>
       </w:r>
     </w:p>
     <w:p>
@@ -198,7 +198,7 @@
           <w:color w:val="FFFFFF"/>
           <w:sz w:val="22"/>
         </w:rPr>
-        <w:t>1.0</w:t>
+        <w:t>1.2</w:t>
       </w:r>
     </w:p>
     <w:p>
@@ -240,6 +240,331 @@
       <w:r>
         <w:br w:type="page"/>
       </w:r>
+    </w:p>
+    <w:p>
+      <w:pPr>
+        <w:shd w:val="clear" w:color="auto" w:fill="E8EAF6"/>
+        <w:pBdr>
+          <w:left w:val="single" w:sz="20" w:space="4" w:color="0D47A1"/>
+        </w:pBdr>
+        <w:spacing w:before="360" w:after="120"/>
+        <w:ind w:left="227"/>
+      </w:pPr>
+      <w:r>
+        <w:rPr>
+          <w:rFonts w:ascii="맑은 고딕" w:hAnsi="맑은 고딕" w:eastAsia="맑은 고딕"/>
+          <w:b/>
+          <w:i w:val="0"/>
+          <w:color w:val="0D47A1"/>
+          <w:sz w:val="30"/>
+        </w:rPr>
+        <w:t>변경 이력</w:t>
+      </w:r>
+    </w:p>
+    <w:tbl>
+      <w:tblPr>
+        <w:tblStyle w:val="TableGrid"/>
+        <w:tblW w:type="auto" w:w="0"/>
+        <w:jc w:val="center"/>
+        <w:tblLook w:firstColumn="1" w:firstRow="1" w:lastColumn="0" w:lastRow="0" w:noHBand="0" w:noVBand="1" w:val="04A0"/>
+      </w:tblPr>
+      <w:tblGrid>
+        <w:gridCol w:w="4536"/>
+        <w:gridCol w:w="4536"/>
+      </w:tblGrid>
+      <w:tr>
+        <w:tc>
+          <w:tcPr>
+            <w:tcW w:type="dxa" w:w="1701"/>
+            <w:shd w:val="clear" w:color="auto" w:fill="1A237E"/>
+            <w:vAlign w:val="center"/>
+          </w:tcPr>
+          <w:p>
+            <w:r/>
+            <w:r>
+              <w:rPr>
+                <w:rFonts w:ascii="맑은 고딕" w:hAnsi="맑은 고딕" w:eastAsia="맑은 고딕"/>
+                <w:b/>
+                <w:i w:val="0"/>
+                <w:color w:val="FFFFFF"/>
+                <w:sz w:val="19"/>
+              </w:rPr>
+              <w:t>날짜</w:t>
+            </w:r>
+          </w:p>
+        </w:tc>
+        <w:tc>
+          <w:tcPr>
+            <w:tcW w:type="dxa" w:w="8504"/>
+            <w:shd w:val="clear" w:color="auto" w:fill="1A237E"/>
+            <w:vAlign w:val="center"/>
+          </w:tcPr>
+          <w:p>
+            <w:r/>
+            <w:r>
+              <w:rPr>
+                <w:rFonts w:ascii="맑은 고딕" w:hAnsi="맑은 고딕" w:eastAsia="맑은 고딕"/>
+                <w:b/>
+                <w:i w:val="0"/>
+                <w:color w:val="FFFFFF"/>
+                <w:sz w:val="19"/>
+              </w:rPr>
+              <w:t>주요 변경 내용</w:t>
+            </w:r>
+          </w:p>
+        </w:tc>
+      </w:tr>
+      <w:tr>
+        <w:tc>
+          <w:tcPr>
+            <w:tcW w:type="dxa" w:w="1701"/>
+            <w:vAlign w:val="center"/>
+          </w:tcPr>
+          <w:p>
+            <w:r/>
+            <w:r>
+              <w:rPr>
+                <w:rFonts w:ascii="맑은 고딕" w:hAnsi="맑은 고딕" w:eastAsia="맑은 고딕"/>
+                <w:b w:val="0"/>
+                <w:i w:val="0"/>
+                <w:sz w:val="19"/>
+              </w:rPr>
+              <w:t>2026-03-15</w:t>
+            </w:r>
+          </w:p>
+        </w:tc>
+        <w:tc>
+          <w:tcPr>
+            <w:tcW w:type="dxa" w:w="8504"/>
+            <w:vAlign w:val="center"/>
+          </w:tcPr>
+          <w:p>
+            <w:r/>
+            <w:r>
+              <w:rPr>
+                <w:rFonts w:ascii="맑은 고딕" w:hAnsi="맑은 고딕" w:eastAsia="맑은 고딕"/>
+                <w:b w:val="0"/>
+                <w:i w:val="0"/>
+                <w:sz w:val="19"/>
+              </w:rPr>
+              <w:t>에러 처리 3-플랫폼 통합(ProcessErrorCompletion), SendResult::InvalidArgument 추가,</w:t>
+              <w:br/>
+              <w:t>방향별 에러 통계(totalSendErrors / totalRecvErrors) 분리,</w:t>
+              <w:br/>
+              <w:t>DB 워커 수 config화(-w CLI, DEFAULT_DB_WORKER_COUNT / DEFAULT_TASK_QUEUE_WORKER_COUNT),</w:t>
+              <w:br/>
+              <w:t>DBTaskQueue.cpp 포맷 정리, Session::Reset() assert, SessionManager 이중 close 방지</w:t>
+            </w:r>
+          </w:p>
+        </w:tc>
+      </w:tr>
+      <w:tr>
+        <w:tc>
+          <w:tcPr>
+            <w:tcW w:type="dxa" w:w="1701"/>
+            <w:shd w:val="clear" w:color="auto" w:fill="F5F5F5"/>
+            <w:vAlign w:val="center"/>
+          </w:tcPr>
+          <w:p>
+            <w:r/>
+            <w:r>
+              <w:rPr>
+                <w:rFonts w:ascii="맑은 고딕" w:hAnsi="맑은 고딕" w:eastAsia="맑은 고딕"/>
+                <w:b w:val="0"/>
+                <w:i w:val="0"/>
+                <w:sz w:val="19"/>
+              </w:rPr>
+              <w:t>2026-03-10</w:t>
+            </w:r>
+          </w:p>
+        </w:tc>
+        <w:tc>
+          <w:tcPr>
+            <w:tcW w:type="dxa" w:w="8504"/>
+            <w:shd w:val="clear" w:color="auto" w:fill="F5F5F5"/>
+            <w:vAlign w:val="center"/>
+          </w:tcPr>
+          <w:p>
+            <w:r/>
+            <w:r>
+              <w:rPr>
+                <w:rFonts w:ascii="맑은 고딕" w:hAnsi="맑은 고딕" w:eastAsia="맑은 고딕"/>
+                <w:b w:val="0"/>
+                <w:i w:val="0"/>
+                <w:sz w:val="19"/>
+              </w:rPr>
+              <w:t>섹션 11 신규 추가 — 동기화·락·비동기 핵심 메커니즘.</w:t>
+              <w:br/>
+              <w:t>Mermaid 다이어그램 4개 추가.</w:t>
+            </w:r>
+          </w:p>
+        </w:tc>
+      </w:tr>
+      <w:tr>
+        <w:tc>
+          <w:tcPr>
+            <w:tcW w:type="dxa" w:w="1701"/>
+            <w:vAlign w:val="center"/>
+          </w:tcPr>
+          <w:p>
+            <w:r/>
+            <w:r>
+              <w:rPr>
+                <w:rFonts w:ascii="맑은 고딕" w:hAnsi="맑은 고딕" w:eastAsia="맑은 고딕"/>
+                <w:b w:val="0"/>
+                <w:i w:val="0"/>
+                <w:sz w:val="19"/>
+              </w:rPr>
+              <w:t>2026-03-02</w:t>
+            </w:r>
+          </w:p>
+        </w:tc>
+        <w:tc>
+          <w:tcPr>
+            <w:tcW w:type="dxa" w:w="8504"/>
+            <w:vAlign w:val="center"/>
+          </w:tcPr>
+          <w:p>
+            <w:r/>
+            <w:r>
+              <w:rPr>
+                <w:rFonts w:ascii="맑은 고딕" w:hAnsi="맑은 고딕" w:eastAsia="맑은 고딕"/>
+                <w:b w:val="0"/>
+                <w:i w:val="0"/>
+                <w:sz w:val="19"/>
+              </w:rPr>
+              <w:t>비동기 로직 고도화 A~E, Linux Docker 통합 테스트, AsyncScope 풀 재사용 버그 수정</w:t>
+            </w:r>
+          </w:p>
+        </w:tc>
+      </w:tr>
+      <w:tr>
+        <w:tc>
+          <w:tcPr>
+            <w:tcW w:type="dxa" w:w="1701"/>
+            <w:shd w:val="clear" w:color="auto" w:fill="F5F5F5"/>
+            <w:vAlign w:val="center"/>
+          </w:tcPr>
+          <w:p>
+            <w:r/>
+            <w:r>
+              <w:rPr>
+                <w:rFonts w:ascii="맑은 고딕" w:hAnsi="맑은 고딕" w:eastAsia="맑은 고딕"/>
+                <w:b w:val="0"/>
+                <w:i w:val="0"/>
+                <w:sz w:val="19"/>
+              </w:rPr>
+              <w:t>2026-03-01</w:t>
+            </w:r>
+          </w:p>
+        </w:tc>
+        <w:tc>
+          <w:tcPr>
+            <w:tcW w:type="dxa" w:w="8504"/>
+            <w:shd w:val="clear" w:color="auto" w:fill="F5F5F5"/>
+            <w:vAlign w:val="center"/>
+          </w:tcPr>
+          <w:p>
+            <w:r/>
+            <w:r>
+              <w:rPr>
+                <w:rFonts w:ascii="맑은 고딕" w:hAnsi="맑은 고딕" w:eastAsia="맑은 고딕"/>
+                <w:b w:val="0"/>
+                <w:i w:val="0"/>
+                <w:sz w:val="19"/>
+              </w:rPr>
+              <w:t>Core/Memory 버퍼 모듈, 핑퐁 검증, SessionFactory 제거, KeyedDispatcher 도입</w:t>
+            </w:r>
+          </w:p>
+        </w:tc>
+      </w:tr>
+      <w:tr>
+        <w:tc>
+          <w:tcPr>
+            <w:tcW w:type="dxa" w:w="1701"/>
+            <w:vAlign w:val="center"/>
+          </w:tcPr>
+          <w:p>
+            <w:r/>
+            <w:r>
+              <w:rPr>
+                <w:rFonts w:ascii="맑은 고딕" w:hAnsi="맑은 고딕" w:eastAsia="맑은 고딕"/>
+                <w:b w:val="0"/>
+                <w:i w:val="0"/>
+                <w:sz w:val="19"/>
+              </w:rPr>
+              <w:t>2026-02-28</w:t>
+            </w:r>
+          </w:p>
+        </w:tc>
+        <w:tc>
+          <w:tcPr>
+            <w:tcW w:type="dxa" w:w="8504"/>
+            <w:vAlign w:val="center"/>
+          </w:tcPr>
+          <w:p>
+            <w:r/>
+            <w:r>
+              <w:rPr>
+                <w:rFonts w:ascii="맑은 고딕" w:hAnsi="맑은 고딕" w:eastAsia="맑은 고딕"/>
+                <w:b w:val="0"/>
+                <w:i w:val="0"/>
+                <w:sz w:val="19"/>
+              </w:rPr>
+              <w:t>RIO slab pool (WSA 10055 수정), MAX_CONNECTIONS=1000</w:t>
+            </w:r>
+          </w:p>
+        </w:tc>
+      </w:tr>
+      <w:tr>
+        <w:tc>
+          <w:tcPr>
+            <w:tcW w:type="dxa" w:w="1701"/>
+            <w:shd w:val="clear" w:color="auto" w:fill="F5F5F5"/>
+            <w:vAlign w:val="center"/>
+          </w:tcPr>
+          <w:p>
+            <w:r/>
+            <w:r>
+              <w:rPr>
+                <w:rFonts w:ascii="맑은 고딕" w:hAnsi="맑은 고딕" w:eastAsia="맑은 고딕"/>
+                <w:b w:val="0"/>
+                <w:i w:val="0"/>
+                <w:sz w:val="19"/>
+              </w:rPr>
+              <w:t>2026-02-26</w:t>
+            </w:r>
+          </w:p>
+        </w:tc>
+        <w:tc>
+          <w:tcPr>
+            <w:tcW w:type="dxa" w:w="8504"/>
+            <w:shd w:val="clear" w:color="auto" w:fill="F5F5F5"/>
+            <w:vAlign w:val="center"/>
+          </w:tcPr>
+          <w:p>
+            <w:r/>
+            <w:r>
+              <w:rPr>
+                <w:rFonts w:ascii="맑은 고딕" w:hAnsi="맑은 고딕" w:eastAsia="맑은 고딕"/>
+                <w:b w:val="0"/>
+                <w:i w:val="0"/>
+                <w:sz w:val="19"/>
+              </w:rPr>
+              <w:t>초기 작성</w:t>
+            </w:r>
+          </w:p>
+        </w:tc>
+      </w:tr>
+    </w:tbl>
+    <w:p/>
+    <w:p>
+      <w:pPr>
+        <w:spacing w:before="120" w:after="120"/>
+        <w:pBdr>
+          <w:bottom w:val="single" w:sz="4" w:space="1" w:color="CCCCCC"/>
+        </w:pBdr>
+      </w:pPr>
     </w:p>
     <w:p>
       <w:pPr>
@@ -2260,7 +2585,7 @@
           <w:color w:val="212121"/>
           <w:sz w:val="21"/>
         </w:rPr>
-        <w:t>송신 경로는 플랫폼에 따라 분기된다. mIsSending CAS와 mSendQueueSize atomic으로 불필요한 락 경쟁과 이중 전송을 방지한다.</w:t>
+        <w:t>Session::Send()는 SendResult를 반환해 호출자에게 백프레셔 피드백을 제공한다. mIsSending CAS와 mSendQueueSize atomic으로 불필요한 락 경쟁과 이중 전송을 방지한다.</w:t>
       </w:r>
     </w:p>
     <w:tbl>
@@ -2292,13 +2617,13 @@
                 <w:color w:val="FFFFFF"/>
                 <w:sz w:val="19"/>
               </w:rPr>
-              <w:t>경로</w:t>
+              <w:t>SendResult 값</w:t>
             </w:r>
           </w:p>
         </w:tc>
         <w:tc>
           <w:tcPr>
-            <w:tcW w:type="dxa" w:w="3969"/>
+            <w:tcW w:type="dxa" w:w="3685"/>
             <w:shd w:val="clear" w:color="auto" w:fill="1A237E"/>
             <w:vAlign w:val="center"/>
           </w:tcPr>
@@ -2312,13 +2637,13 @@
                 <w:color w:val="FFFFFF"/>
                 <w:sz w:val="19"/>
               </w:rPr>
-              <w:t>처리 방식</w:t>
+              <w:t>의미</w:t>
             </w:r>
           </w:p>
         </w:tc>
         <w:tc>
           <w:tcPr>
-            <w:tcW w:type="dxa" w:w="3969"/>
+            <w:tcW w:type="dxa" w:w="4252"/>
             <w:shd w:val="clear" w:color="auto" w:fill="1A237E"/>
             <w:vAlign w:val="center"/>
           </w:tcPr>
@@ -2332,7 +2657,7 @@
                 <w:color w:val="FFFFFF"/>
                 <w:sz w:val="19"/>
               </w:rPr>
-              <w:t>코드 포인트</w:t>
+              <w:t>호출자 조치</w:t>
             </w:r>
           </w:p>
         </w:tc>
@@ -2352,13 +2677,13 @@
                 <w:i w:val="0"/>
                 <w:sz w:val="19"/>
               </w:rPr>
-              <w:t>Windows + RIO</w:t>
+              <w:t>Ok</w:t>
             </w:r>
           </w:p>
         </w:tc>
         <w:tc>
           <w:tcPr>
-            <w:tcW w:type="dxa" w:w="3969"/>
+            <w:tcW w:type="dxa" w:w="3685"/>
             <w:vAlign w:val="center"/>
           </w:tcPr>
           <w:p>
@@ -2370,15 +2695,13 @@
                 <w:i w:val="0"/>
                 <w:sz w:val="19"/>
               </w:rPr>
-              <w:t>Send() → provider SendAsync() 직행</w:t>
-              <w:br/>
-              <w:t>(큐 경유 없음)</w:t>
+              <w:t>전송 성공 (큐잉 또는 즉시 전송)</w:t>
             </w:r>
           </w:p>
         </w:tc>
         <w:tc>
           <w:tcPr>
-            <w:tcW w:type="dxa" w:w="3969"/>
+            <w:tcW w:type="dxa" w:w="4252"/>
             <w:vAlign w:val="center"/>
           </w:tcPr>
           <w:p>
@@ -2390,7 +2713,7 @@
                 <w:i w:val="0"/>
                 <w:sz w:val="19"/>
               </w:rPr>
-              <w:t>Session.cpp:155</w:t>
+              <w:t>없음</w:t>
             </w:r>
           </w:p>
         </w:tc>
@@ -2411,13 +2734,13 @@
                 <w:i w:val="0"/>
                 <w:sz w:val="19"/>
               </w:rPr>
-              <w:t>IOCP / epoll / kqueue</w:t>
+              <w:t>QueueFull</w:t>
             </w:r>
           </w:p>
         </w:tc>
         <w:tc>
           <w:tcPr>
-            <w:tcW w:type="dxa" w:w="3969"/>
+            <w:tcW w:type="dxa" w:w="3685"/>
             <w:shd w:val="clear" w:color="auto" w:fill="F5F5F5"/>
             <w:vAlign w:val="center"/>
           </w:tcPr>
@@ -2430,17 +2753,13 @@
                 <w:i w:val="0"/>
                 <w:sz w:val="19"/>
               </w:rPr>
-              <w:t>mSendQueue enqueue</w:t>
-              <w:br/>
-              <w:t>→ FlushSendQueue()</w:t>
-              <w:br/>
-              <w:t>→ PostSend()</w:t>
+              <w:t>큐 백프레셔 임계값 초과</w:t>
             </w:r>
           </w:p>
         </w:tc>
         <w:tc>
           <w:tcPr>
-            <w:tcW w:type="dxa" w:w="3969"/>
+            <w:tcW w:type="dxa" w:w="4252"/>
             <w:shd w:val="clear" w:color="auto" w:fill="F5F5F5"/>
             <w:vAlign w:val="center"/>
           </w:tcPr>
@@ -2453,13 +2772,158 @@
                 <w:i w:val="0"/>
                 <w:sz w:val="19"/>
               </w:rPr>
-              <w:t>Session.cpp:248, 261</w:t>
+              <w:t>잠시 후 재시도 또는 세션 종료</w:t>
+            </w:r>
+          </w:p>
+        </w:tc>
+      </w:tr>
+      <w:tr>
+        <w:tc>
+          <w:tcPr>
+            <w:tcW w:type="dxa" w:w="2268"/>
+            <w:vAlign w:val="center"/>
+          </w:tcPr>
+          <w:p>
+            <w:r/>
+            <w:r>
+              <w:rPr>
+                <w:rFonts w:ascii="맑은 고딕" w:hAnsi="맑은 고딕" w:eastAsia="맑은 고딕"/>
+                <w:b w:val="0"/>
+                <w:i w:val="0"/>
+                <w:sz w:val="19"/>
+              </w:rPr>
+              <w:t>NotConnected</w:t>
+            </w:r>
+          </w:p>
+        </w:tc>
+        <w:tc>
+          <w:tcPr>
+            <w:tcW w:type="dxa" w:w="3685"/>
+            <w:vAlign w:val="center"/>
+          </w:tcPr>
+          <w:p>
+            <w:r/>
+            <w:r>
+              <w:rPr>
+                <w:rFonts w:ascii="맑은 고딕" w:hAnsi="맑은 고딕" w:eastAsia="맑은 고딕"/>
+                <w:b w:val="0"/>
+                <w:i w:val="0"/>
+                <w:sz w:val="19"/>
+              </w:rPr>
+              <w:t>세션 미연결</w:t>
+            </w:r>
+          </w:p>
+        </w:tc>
+        <w:tc>
+          <w:tcPr>
+            <w:tcW w:type="dxa" w:w="4252"/>
+            <w:vAlign w:val="center"/>
+          </w:tcPr>
+          <w:p>
+            <w:r/>
+            <w:r>
+              <w:rPr>
+                <w:rFonts w:ascii="맑은 고딕" w:hAnsi="맑은 고딕" w:eastAsia="맑은 고딕"/>
+                <w:b w:val="0"/>
+                <w:i w:val="0"/>
+                <w:sz w:val="19"/>
+              </w:rPr>
+              <w:t>재시도 금지</w:t>
+            </w:r>
+          </w:p>
+        </w:tc>
+      </w:tr>
+      <w:tr>
+        <w:tc>
+          <w:tcPr>
+            <w:tcW w:type="dxa" w:w="2268"/>
+            <w:shd w:val="clear" w:color="auto" w:fill="F5F5F5"/>
+            <w:vAlign w:val="center"/>
+          </w:tcPr>
+          <w:p>
+            <w:r/>
+            <w:r>
+              <w:rPr>
+                <w:rFonts w:ascii="맑은 고딕" w:hAnsi="맑은 고딕" w:eastAsia="맑은 고딕"/>
+                <w:b w:val="0"/>
+                <w:i w:val="0"/>
+                <w:sz w:val="19"/>
+              </w:rPr>
+              <w:t>InvalidArgument</w:t>
+            </w:r>
+          </w:p>
+        </w:tc>
+        <w:tc>
+          <w:tcPr>
+            <w:tcW w:type="dxa" w:w="3685"/>
+            <w:shd w:val="clear" w:color="auto" w:fill="F5F5F5"/>
+            <w:vAlign w:val="center"/>
+          </w:tcPr>
+          <w:p>
+            <w:r/>
+            <w:r>
+              <w:rPr>
+                <w:rFonts w:ascii="맑은 고딕" w:hAnsi="맑은 고딕" w:eastAsia="맑은 고딕"/>
+                <w:b w:val="0"/>
+                <w:i w:val="0"/>
+                <w:sz w:val="19"/>
+              </w:rPr>
+              <w:t>null 또는 최대 크기 초과 패킷</w:t>
+            </w:r>
+          </w:p>
+        </w:tc>
+        <w:tc>
+          <w:tcPr>
+            <w:tcW w:type="dxa" w:w="4252"/>
+            <w:shd w:val="clear" w:color="auto" w:fill="F5F5F5"/>
+            <w:vAlign w:val="center"/>
+          </w:tcPr>
+          <w:p>
+            <w:r/>
+            <w:r>
+              <w:rPr>
+                <w:rFonts w:ascii="맑은 고딕" w:hAnsi="맑은 고딕" w:eastAsia="맑은 고딕"/>
+                <w:b w:val="0"/>
+                <w:i w:val="0"/>
+                <w:sz w:val="19"/>
+              </w:rPr>
+              <w:t>재시도 금지 — 호출 측 버그</w:t>
             </w:r>
           </w:p>
         </w:tc>
       </w:tr>
     </w:tbl>
     <w:p/>
+    <w:p>
+      <w:pPr>
+        <w:shd w:val="clear" w:color="auto" w:fill="E3F2FD"/>
+        <w:pBdr>
+          <w:left w:val="single" w:sz="8" w:space="4" w:color="1565C0"/>
+        </w:pBdr>
+        <w:spacing w:before="100" w:after="100"/>
+        <w:ind w:left="227" w:right="227"/>
+      </w:pPr>
+      <w:r>
+        <w:rPr>
+          <w:rFonts w:ascii="맑은 고딕" w:hAnsi="맑은 고딕" w:eastAsia="맑은 고딕"/>
+          <w:b/>
+          <w:i w:val="0"/>
+          <w:color w:val="1565C0"/>
+          <w:sz w:val="20"/>
+        </w:rPr>
+        <w:t xml:space="preserve">ℹ  참고:  </w:t>
+      </w:r>
+      <w:r>
+        <w:rPr>
+          <w:rFonts w:ascii="맑은 고딕" w:hAnsi="맑은 고딕" w:eastAsia="맑은 고딕"/>
+          <w:b w:val="0"/>
+          <w:i w:val="0"/>
+          <w:color w:val="212121"/>
+          <w:sz w:val="20"/>
+        </w:rPr>
+        <w:t>bytesSent &lt;= 0인 송신 완료는 DataSent 이벤트를 발생시키지 않고 ProcessErrorCompletion()으로 라우팅하여 세션을 정상 종료한다. (BaseNetworkEngine.cpp:ProcessSendCompletion)</w:t>
+      </w:r>
+    </w:p>
     <w:p>
       <w:pPr>
         <w:shd w:val="clear" w:color="auto" w:fill="E3F2FD"/>
@@ -2490,6 +2954,299 @@
         <w:t>이벤트 스레드 일관성: OnDisconnected는 CloseConnection() 경로와 recv 오류 경로 모두 로직 스레드풀로 전달되어 실행된다. 콜백 호출 스레드가 일관하게 유지된다.</w:t>
       </w:r>
     </w:p>
+    <w:p>
+      <w:pPr>
+        <w:pBdr>
+          <w:left w:val="single" w:sz="12" w:space="4" w:color="1565C0"/>
+        </w:pBdr>
+        <w:spacing w:before="240" w:after="80"/>
+        <w:ind w:left="170"/>
+      </w:pPr>
+      <w:r>
+        <w:rPr>
+          <w:rFonts w:ascii="맑은 고딕" w:hAnsi="맑은 고딕" w:eastAsia="맑은 고딕"/>
+          <w:b/>
+          <w:i w:val="0"/>
+          <w:color w:val="1565C0"/>
+          <w:sz w:val="26"/>
+        </w:rPr>
+        <w:t>2.6 에러 처리 통합 (ProcessErrorCompletion)</w:t>
+      </w:r>
+    </w:p>
+    <w:p>
+      <w:pPr>
+        <w:spacing w:after="80"/>
+      </w:pPr>
+      <w:r>
+        <w:rPr>
+          <w:rFonts w:ascii="맑은 고딕" w:hAnsi="맑은 고딕" w:eastAsia="맑은 고딕"/>
+          <w:b w:val="0"/>
+          <w:i w:val="0"/>
+          <w:color w:val="212121"/>
+          <w:sz w:val="21"/>
+        </w:rPr>
+        <w:t>3개 플랫폼(Windows/Linux/macOS) 에러 완료 경로를 단일 헬퍼로 통합했다. Send/Recv 방향 구분, AsyncScope 경유 disconnect, 방향별 통계 집계를 모든 플랫폼에서 일관되게 처리한다.</w:t>
+      </w:r>
+    </w:p>
+    <w:tbl>
+      <w:tblPr>
+        <w:tblStyle w:val="TableGrid"/>
+        <w:tblW w:type="auto" w:w="0"/>
+        <w:jc w:val="center"/>
+        <w:tblLook w:firstColumn="1" w:firstRow="1" w:lastColumn="0" w:lastRow="0" w:noHBand="0" w:noVBand="1" w:val="04A0"/>
+      </w:tblPr>
+      <w:tblGrid>
+        <w:gridCol w:w="4536"/>
+        <w:gridCol w:w="4536"/>
+      </w:tblGrid>
+      <w:tr>
+        <w:tc>
+          <w:tcPr>
+            <w:tcW w:type="dxa" w:w="2268"/>
+            <w:shd w:val="clear" w:color="auto" w:fill="1A237E"/>
+            <w:vAlign w:val="center"/>
+          </w:tcPr>
+          <w:p>
+            <w:r/>
+            <w:r>
+              <w:rPr>
+                <w:rFonts w:ascii="맑은 고딕" w:hAnsi="맑은 고딕" w:eastAsia="맑은 고딕"/>
+                <w:b/>
+                <w:i w:val="0"/>
+                <w:color w:val="FFFFFF"/>
+                <w:sz w:val="19"/>
+              </w:rPr>
+              <w:t>항목</w:t>
+            </w:r>
+          </w:p>
+        </w:tc>
+        <w:tc>
+          <w:tcPr>
+            <w:tcW w:type="dxa" w:w="7937"/>
+            <w:shd w:val="clear" w:color="auto" w:fill="1A237E"/>
+            <w:vAlign w:val="center"/>
+          </w:tcPr>
+          <w:p>
+            <w:r/>
+            <w:r>
+              <w:rPr>
+                <w:rFonts w:ascii="맑은 고딕" w:hAnsi="맑은 고딕" w:eastAsia="맑은 고딕"/>
+                <w:b/>
+                <w:i w:val="0"/>
+                <w:color w:val="FFFFFF"/>
+                <w:sz w:val="19"/>
+              </w:rPr>
+              <w:t>내용</w:t>
+            </w:r>
+          </w:p>
+        </w:tc>
+      </w:tr>
+      <w:tr>
+        <w:tc>
+          <w:tcPr>
+            <w:tcW w:type="dxa" w:w="2268"/>
+            <w:vAlign w:val="center"/>
+          </w:tcPr>
+          <w:p>
+            <w:r/>
+            <w:r>
+              <w:rPr>
+                <w:rFonts w:ascii="맑은 고딕" w:hAnsi="맑은 고딕" w:eastAsia="맑은 고딕"/>
+                <w:b w:val="0"/>
+                <w:i w:val="0"/>
+                <w:sz w:val="19"/>
+              </w:rPr>
+              <w:t>함수 시그니처</w:t>
+            </w:r>
+          </w:p>
+        </w:tc>
+        <w:tc>
+          <w:tcPr>
+            <w:tcW w:type="dxa" w:w="7937"/>
+            <w:vAlign w:val="center"/>
+          </w:tcPr>
+          <w:p>
+            <w:r/>
+            <w:r>
+              <w:rPr>
+                <w:rFonts w:ascii="맑은 고딕" w:hAnsi="맑은 고딕" w:eastAsia="맑은 고딕"/>
+                <w:b w:val="0"/>
+                <w:i w:val="0"/>
+                <w:sz w:val="19"/>
+              </w:rPr>
+              <w:t>ProcessErrorCompletion(SessionRef, AsyncIOType, OSError)</w:t>
+            </w:r>
+          </w:p>
+        </w:tc>
+      </w:tr>
+      <w:tr>
+        <w:tc>
+          <w:tcPr>
+            <w:tcW w:type="dxa" w:w="2268"/>
+            <w:shd w:val="clear" w:color="auto" w:fill="F5F5F5"/>
+            <w:vAlign w:val="center"/>
+          </w:tcPr>
+          <w:p>
+            <w:r/>
+            <w:r>
+              <w:rPr>
+                <w:rFonts w:ascii="맑은 고딕" w:hAnsi="맑은 고딕" w:eastAsia="맑은 고딕"/>
+                <w:b w:val="0"/>
+                <w:i w:val="0"/>
+                <w:sz w:val="19"/>
+              </w:rPr>
+              <w:t>방향별 카운터</w:t>
+            </w:r>
+          </w:p>
+        </w:tc>
+        <w:tc>
+          <w:tcPr>
+            <w:tcW w:type="dxa" w:w="7937"/>
+            <w:shd w:val="clear" w:color="auto" w:fill="F5F5F5"/>
+            <w:vAlign w:val="center"/>
+          </w:tcPr>
+          <w:p>
+            <w:r/>
+            <w:r>
+              <w:rPr>
+                <w:rFonts w:ascii="맑은 고딕" w:hAnsi="맑은 고딕" w:eastAsia="맑은 고딕"/>
+                <w:b w:val="0"/>
+                <w:i w:val="0"/>
+                <w:sz w:val="19"/>
+              </w:rPr>
+              <w:t>AsyncIOType::Send → mTotalSendErrors++</w:t>
+              <w:br/>
+              <w:t>AsyncIOType::Recv → mTotalRecvErrors++</w:t>
+              <w:br/>
+              <w:t>Statistics::totalErrors = sendErrors + recvErrors</w:t>
+            </w:r>
+          </w:p>
+        </w:tc>
+      </w:tr>
+      <w:tr>
+        <w:tc>
+          <w:tcPr>
+            <w:tcW w:type="dxa" w:w="2268"/>
+            <w:vAlign w:val="center"/>
+          </w:tcPr>
+          <w:p>
+            <w:r/>
+            <w:r>
+              <w:rPr>
+                <w:rFonts w:ascii="맑은 고딕" w:hAnsi="맑은 고딕" w:eastAsia="맑은 고딕"/>
+                <w:b w:val="0"/>
+                <w:i w:val="0"/>
+                <w:sz w:val="19"/>
+              </w:rPr>
+              <w:t>예상 종료 판별</w:t>
+            </w:r>
+          </w:p>
+        </w:tc>
+        <w:tc>
+          <w:tcPr>
+            <w:tcW w:type="dxa" w:w="7937"/>
+            <w:vAlign w:val="center"/>
+          </w:tcPr>
+          <w:p>
+            <w:r/>
+            <w:r>
+              <w:rPr>
+                <w:rFonts w:ascii="맑은 고딕" w:hAnsi="맑은 고딕" w:eastAsia="맑은 고딕"/>
+                <w:b w:val="0"/>
+                <w:i w:val="0"/>
+                <w:sz w:val="19"/>
+              </w:rPr>
+              <w:t>WSAECONNRESET / WSAESHUTDOWN / EPIPE / ECONNRESET / osError==0</w:t>
+              <w:br/>
+              <w:t>→ Logger::Warn (정상 종료)</w:t>
+              <w:br/>
+              <w:t>그 외 → Logger::Error (비정상)</w:t>
+            </w:r>
+          </w:p>
+        </w:tc>
+      </w:tr>
+      <w:tr>
+        <w:tc>
+          <w:tcPr>
+            <w:tcW w:type="dxa" w:w="2268"/>
+            <w:shd w:val="clear" w:color="auto" w:fill="F5F5F5"/>
+            <w:vAlign w:val="center"/>
+          </w:tcPr>
+          <w:p>
+            <w:r/>
+            <w:r>
+              <w:rPr>
+                <w:rFonts w:ascii="맑은 고딕" w:hAnsi="맑은 고딕" w:eastAsia="맑은 고딕"/>
+                <w:b w:val="0"/>
+                <w:i w:val="0"/>
+                <w:sz w:val="19"/>
+              </w:rPr>
+              <w:t>disconnect 경로</w:t>
+            </w:r>
+          </w:p>
+        </w:tc>
+        <w:tc>
+          <w:tcPr>
+            <w:tcW w:type="dxa" w:w="7937"/>
+            <w:shd w:val="clear" w:color="auto" w:fill="F5F5F5"/>
+            <w:vAlign w:val="center"/>
+          </w:tcPr>
+          <w:p>
+            <w:r/>
+            <w:r>
+              <w:rPr>
+                <w:rFonts w:ascii="맑은 고딕" w:hAnsi="맑은 고딕" w:eastAsia="맑은 고딕"/>
+                <w:b w:val="0"/>
+                <w:i w:val="0"/>
+                <w:sz w:val="19"/>
+              </w:rPr>
+              <w:t>ProcessRecvCompletion(session, 0, nullptr) 경유</w:t>
+              <w:br/>
+              <w:t>→ AsyncScope 경유 OnDisconnected — 모든 플랫폼 동일</w:t>
+            </w:r>
+          </w:p>
+        </w:tc>
+      </w:tr>
+      <w:tr>
+        <w:tc>
+          <w:tcPr>
+            <w:tcW w:type="dxa" w:w="2268"/>
+            <w:vAlign w:val="center"/>
+          </w:tcPr>
+          <w:p>
+            <w:r/>
+            <w:r>
+              <w:rPr>
+                <w:rFonts w:ascii="맑은 고딕" w:hAnsi="맑은 고딕" w:eastAsia="맑은 고딕"/>
+                <w:b w:val="0"/>
+                <w:i w:val="0"/>
+                <w:sz w:val="19"/>
+              </w:rPr>
+              <w:t>코드 포인트</w:t>
+            </w:r>
+          </w:p>
+        </w:tc>
+        <w:tc>
+          <w:tcPr>
+            <w:tcW w:type="dxa" w:w="7937"/>
+            <w:vAlign w:val="center"/>
+          </w:tcPr>
+          <w:p>
+            <w:r/>
+            <w:r>
+              <w:rPr>
+                <w:rFonts w:ascii="맑은 고딕" w:hAnsi="맑은 고딕" w:eastAsia="맑은 고딕"/>
+                <w:b w:val="0"/>
+                <w:i w:val="0"/>
+                <w:sz w:val="19"/>
+              </w:rPr>
+              <w:t>BaseNetworkEngine.cpp:ProcessErrorCompletion</w:t>
+            </w:r>
+          </w:p>
+        </w:tc>
+      </w:tr>
+    </w:tbl>
+    <w:p/>
     <w:p>
       <w:pPr>
         <w:spacing w:before="120" w:after="120"/>
@@ -2677,7 +3434,7 @@
       <w:tr>
         <w:tc>
           <w:tcPr>
-            <w:tcW w:type="dxa" w:w="2268"/>
+            <w:tcW w:type="dxa" w:w="2551"/>
             <w:shd w:val="clear" w:color="auto" w:fill="1A237E"/>
             <w:vAlign w:val="center"/>
           </w:tcPr>
@@ -2717,7 +3474,7 @@
         </w:tc>
         <w:tc>
           <w:tcPr>
-            <w:tcW w:type="dxa" w:w="5386"/>
+            <w:tcW w:type="dxa" w:w="5102"/>
             <w:shd w:val="clear" w:color="auto" w:fill="1A237E"/>
             <w:vAlign w:val="center"/>
           </w:tcPr>
@@ -2739,7 +3496,7 @@
       <w:tr>
         <w:tc>
           <w:tcPr>
-            <w:tcW w:type="dxa" w:w="2268"/>
+            <w:tcW w:type="dxa" w:w="2551"/>
             <w:vAlign w:val="center"/>
           </w:tcPr>
           <w:p>
@@ -2777,7 +3534,7 @@
         </w:tc>
         <w:tc>
           <w:tcPr>
-            <w:tcW w:type="dxa" w:w="5386"/>
+            <w:tcW w:type="dxa" w:w="5102"/>
             <w:vAlign w:val="center"/>
           </w:tcPr>
           <w:p>
@@ -2799,7 +3556,7 @@
       <w:tr>
         <w:tc>
           <w:tcPr>
-            <w:tcW w:type="dxa" w:w="2268"/>
+            <w:tcW w:type="dxa" w:w="2551"/>
             <w:shd w:val="clear" w:color="auto" w:fill="F5F5F5"/>
             <w:vAlign w:val="center"/>
           </w:tcPr>
@@ -2837,7 +3594,7 @@
         </w:tc>
         <w:tc>
           <w:tcPr>
-            <w:tcW w:type="dxa" w:w="5386"/>
+            <w:tcW w:type="dxa" w:w="5102"/>
             <w:shd w:val="clear" w:color="auto" w:fill="F5F5F5"/>
             <w:vAlign w:val="center"/>
           </w:tcPr>
@@ -2860,7 +3617,7 @@
       <w:tr>
         <w:tc>
           <w:tcPr>
-            <w:tcW w:type="dxa" w:w="2268"/>
+            <w:tcW w:type="dxa" w:w="2551"/>
             <w:vAlign w:val="center"/>
           </w:tcPr>
           <w:p>
@@ -2872,7 +3629,7 @@
                 <w:i w:val="0"/>
                 <w:sz w:val="19"/>
               </w:rPr>
-              <w:t>DB 워커 스레드</w:t>
+              <w:t>DB 워커 스레드 (TestServer)</w:t>
             </w:r>
           </w:p>
         </w:tc>
@@ -2890,15 +3647,17 @@
                 <w:i w:val="0"/>
                 <w:sz w:val="19"/>
               </w:rPr>
-              <w:t>DBTaskQueue (워커 1개)</w:t>
+              <w:t>DBTaskQueue</w:t>
               <w:br/>
-              <w:t>OrderedTaskQueue</w:t>
+              <w:t>기본 1개, -w 플래그로 설정</w:t>
+              <w:br/>
+              <w:t>(DEFAULT_TASK_QUEUE_WORKER_COUNT)</w:t>
             </w:r>
           </w:p>
         </w:tc>
         <w:tc>
           <w:tcPr>
-            <w:tcW w:type="dxa" w:w="5386"/>
+            <w:tcW w:type="dxa" w:w="5102"/>
             <w:vAlign w:val="center"/>
           </w:tcPr>
           <w:p>
@@ -2913,6 +3672,8 @@
               <w:t>논블로킹 DB I/O 실행</w:t>
               <w:br/>
               <w:t>WAL 영속성 보장</w:t>
+              <w:br/>
+              <w:t>sessionId % workerCount 해시 친화도</w:t>
             </w:r>
           </w:p>
         </w:tc>
@@ -2920,8 +3681,72 @@
       <w:tr>
         <w:tc>
           <w:tcPr>
-            <w:tcW w:type="dxa" w:w="2268"/>
+            <w:tcW w:type="dxa" w:w="2551"/>
             <w:shd w:val="clear" w:color="auto" w:fill="F5F5F5"/>
+            <w:vAlign w:val="center"/>
+          </w:tcPr>
+          <w:p>
+            <w:r/>
+            <w:r>
+              <w:rPr>
+                <w:rFonts w:ascii="맑은 고딕" w:hAnsi="맑은 고딕" w:eastAsia="맑은 고딕"/>
+                <w:b w:val="0"/>
+                <w:i w:val="0"/>
+                <w:sz w:val="19"/>
+              </w:rPr>
+              <w:t>DB 워커 스레드 (DBServer)</w:t>
+            </w:r>
+          </w:p>
+        </w:tc>
+        <w:tc>
+          <w:tcPr>
+            <w:tcW w:type="dxa" w:w="2551"/>
+            <w:shd w:val="clear" w:color="auto" w:fill="F5F5F5"/>
+            <w:vAlign w:val="center"/>
+          </w:tcPr>
+          <w:p>
+            <w:r/>
+            <w:r>
+              <w:rPr>
+                <w:rFonts w:ascii="맑은 고딕" w:hAnsi="맑은 고딕" w:eastAsia="맑은 고딕"/>
+                <w:b w:val="0"/>
+                <w:i w:val="0"/>
+                <w:sz w:val="19"/>
+              </w:rPr>
+              <w:t>OrderedTaskQueue</w:t>
+              <w:br/>
+              <w:t>기본 4개, -w 플래그로 설정</w:t>
+              <w:br/>
+              <w:t>(DEFAULT_DB_WORKER_COUNT)</w:t>
+            </w:r>
+          </w:p>
+        </w:tc>
+        <w:tc>
+          <w:tcPr>
+            <w:tcW w:type="dxa" w:w="5102"/>
+            <w:shd w:val="clear" w:color="auto" w:fill="F5F5F5"/>
+            <w:vAlign w:val="center"/>
+          </w:tcPr>
+          <w:p>
+            <w:r/>
+            <w:r>
+              <w:rPr>
+                <w:rFonts w:ascii="맑은 고딕" w:hAnsi="맑은 고딕" w:eastAsia="맑은 고딕"/>
+                <w:b w:val="0"/>
+                <w:i w:val="0"/>
+                <w:sz w:val="19"/>
+              </w:rPr>
+              <w:t>serverId 단위 순서 보장</w:t>
+              <w:br/>
+              <w:t>KeyedDispatcher 래핑</w:t>
+            </w:r>
+          </w:p>
+        </w:tc>
+      </w:tr>
+      <w:tr>
+        <w:tc>
+          <w:tcPr>
+            <w:tcW w:type="dxa" w:w="2551"/>
             <w:vAlign w:val="center"/>
           </w:tcPr>
           <w:p>
@@ -2940,7 +3765,6 @@
         <w:tc>
           <w:tcPr>
             <w:tcW w:type="dxa" w:w="2551"/>
-            <w:shd w:val="clear" w:color="auto" w:fill="F5F5F5"/>
             <w:vAlign w:val="center"/>
           </w:tcPr>
           <w:p>
@@ -2958,8 +3782,7 @@
         </w:tc>
         <w:tc>
           <w:tcPr>
-            <w:tcW w:type="dxa" w:w="5386"/>
-            <w:shd w:val="clear" w:color="auto" w:fill="F5F5F5"/>
+            <w:tcW w:type="dxa" w:w="5102"/>
             <w:vAlign w:val="center"/>
           </w:tcPr>
           <w:p>
@@ -3041,7 +3864,7 @@
           <w:color w:val="212121"/>
           <w:sz w:val="21"/>
         </w:rPr>
-        <w:t>ClientSession은 접속/해제 시점을 직접 DB에 기록하지 않고 DBTaskQueue에 enqueue한다. DB I/O 지연이 로직 워커를 블로킹하지 않으며, 워커 1개로 같은 sessionId 작업의 순서를 보장한다.</w:t>
+        <w:t>TestServer는 접속/해제 시점을 직접 DB에 기록하지 않고 DBTaskQueue에 enqueue한다. DB I/O 지연이 로직 워커를 블로킹하지 않는다. 워커 수는 CLI -w 플래그로 설정 가능하며 기본값은 1(DEFAULT_TASK_QUEUE_WORKER_COUNT)이다.</w:t>
       </w:r>
     </w:p>
     <w:p>
@@ -3057,7 +3880,7 @@
           <w:i w:val="0"/>
           <w:sz w:val="21"/>
         </w:rPr>
-        <w:t>OnConnected → AsyncRecordConnectTime → RecordConnectTime</w:t>
+        <w:t>OnClientConnectionEstablished → RecordConnectTime</w:t>
       </w:r>
     </w:p>
     <w:p>
@@ -3073,7 +3896,7 @@
           <w:i w:val="0"/>
           <w:sz w:val="21"/>
         </w:rPr>
-        <w:t>OnDisconnected → AsyncRecordDisconnectTime → RecordDisconnectTime</w:t>
+        <w:t>OnClientConnectionClosed → RecordDisconnectTime</w:t>
       </w:r>
     </w:p>
     <w:p>
@@ -3089,7 +3912,69 @@
           <w:i w:val="0"/>
           <w:sz w:val="21"/>
         </w:rPr>
-        <w:t>멀티워커 필요 시 OrderedTaskQueue로 전환 (코드 주석에 가이드 있음)</w:t>
+        <w:t>sessionId % workerCount 해시 친화도 — 워커 수와 무관하게 세션별 순서 보장</w:t>
+      </w:r>
+    </w:p>
+    <w:p>
+      <w:pPr>
+        <w:pStyle w:val="ListBullet"/>
+        <w:spacing w:after="40"/>
+        <w:ind w:left="283"/>
+      </w:pPr>
+      <w:r>
+        <w:rPr>
+          <w:rFonts w:ascii="맑은 고딕" w:hAnsi="맑은 고딕" w:eastAsia="맑은 고딕"/>
+          <w:b w:val="0"/>
+          <w:i w:val="0"/>
+          <w:sz w:val="21"/>
+        </w:rPr>
+        <w:t>1 워커: 가장 단순, 친화도 계산 불필요</w:t>
+      </w:r>
+    </w:p>
+    <w:p>
+      <w:pPr>
+        <w:pStyle w:val="ListBullet"/>
+        <w:spacing w:after="40"/>
+        <w:ind w:left="283"/>
+      </w:pPr>
+      <w:r>
+        <w:rPr>
+          <w:rFonts w:ascii="맑은 고딕" w:hAnsi="맑은 고딕" w:eastAsia="맑은 고딕"/>
+          <w:b w:val="0"/>
+          <w:i w:val="0"/>
+          <w:sz w:val="21"/>
+        </w:rPr>
+        <w:t>N 워커: 처리량 향상, 세션별 순서는 해시 친화도로 여전히 보장</w:t>
+      </w:r>
+    </w:p>
+    <w:p>
+      <w:pPr>
+        <w:shd w:val="clear" w:color="auto" w:fill="E8F5E9"/>
+        <w:pBdr>
+          <w:left w:val="single" w:sz="8" w:space="4" w:color="1B5E20"/>
+        </w:pBdr>
+        <w:spacing w:before="100" w:after="100"/>
+        <w:ind w:left="227" w:right="227"/>
+      </w:pPr>
+      <w:r>
+        <w:rPr>
+          <w:rFonts w:ascii="맑은 고딕" w:hAnsi="맑은 고딕" w:eastAsia="맑은 고딕"/>
+          <w:b/>
+          <w:i w:val="0"/>
+          <w:color w:val="1B5E20"/>
+          <w:sz w:val="20"/>
+        </w:rPr>
+        <w:t xml:space="preserve">✔  핵심:  </w:t>
+      </w:r>
+      <w:r>
+        <w:rPr>
+          <w:rFonts w:ascii="맑은 고딕" w:hAnsi="맑은 고딕" w:eastAsia="맑은 고딕"/>
+          <w:b w:val="0"/>
+          <w:i w:val="0"/>
+          <w:color w:val="212121"/>
+          <w:sz w:val="20"/>
+        </w:rPr>
+        <w:t>워커 수를 바꿔도 순서는 깨지지 않는다. WAL 복구도 seq 순 정렬 재인큐이므로 재시작 시 worker count 변경이 안전하다.</w:t>
       </w:r>
     </w:p>
     <w:p>
@@ -3109,7 +3994,7 @@
           <w:color w:val="37474F"/>
           <w:sz w:val="19"/>
         </w:rPr>
-        <w:t>ClientSession.cpp:32, 76, 114</w:t>
+        <w:t>TestServer.cpp:OnClientConnectionEstablished</w:t>
       </w:r>
       <w:r>
         <w:rPr>
@@ -3139,7 +4024,7 @@
           <w:color w:val="37474F"/>
           <w:sz w:val="19"/>
         </w:rPr>
-        <w:t>DBTaskQueue.cpp:206</w:t>
+        <w:t>DBTaskQueue.cpp:EnqueueTask</w:t>
       </w:r>
       <w:r>
         <w:rPr>
@@ -3169,7 +4054,7 @@
           <w:color w:val="37474F"/>
           <w:sz w:val="19"/>
         </w:rPr>
-        <w:t>DBTaskQueue.cpp:321</w:t>
+        <w:t>DBTaskQueue.cpp:WorkerThreadFunc</w:t>
       </w:r>
       <w:r>
         <w:rPr>
@@ -3180,6 +4065,36 @@
           <w:sz w:val="18"/>
         </w:rPr>
         <w:t xml:space="preserve">  — 워커 실행 루프</w:t>
+      </w:r>
+    </w:p>
+    <w:p>
+      <w:pPr>
+        <w:shd w:val="clear" w:color="auto" w:fill="F5F5F5"/>
+        <w:pBdr>
+          <w:left w:val="single" w:sz="6" w:space="4" w:color="90A4AE"/>
+        </w:pBdr>
+        <w:spacing w:before="40" w:after="40"/>
+        <w:ind w:left="340"/>
+      </w:pPr>
+      <w:r>
+        <w:rPr>
+          <w:rFonts w:ascii="Consolas" w:hAnsi="Consolas" w:eastAsia="Consolas"/>
+          <w:b/>
+          <w:i w:val="0"/>
+          <w:color w:val="37474F"/>
+          <w:sz w:val="19"/>
+        </w:rPr>
+        <w:t>NetworkTypes.h:DEFAULT_TASK_QUEUE_WORKER_COUNT</w:t>
+      </w:r>
+      <w:r>
+        <w:rPr>
+          <w:rFonts w:ascii="맑은 고딕" w:hAnsi="맑은 고딕" w:eastAsia="맑은 고딕"/>
+          <w:b w:val="0"/>
+          <w:i w:val="0"/>
+          <w:color w:val="757575"/>
+          <w:sz w:val="18"/>
+        </w:rPr>
+        <w:t xml:space="preserve">  — 기본 워커 수 상수</w:t>
       </w:r>
     </w:p>
     <w:p>
@@ -3606,7 +4521,7 @@
           <w:color w:val="212121"/>
           <w:sz w:val="21"/>
         </w:rPr>
-        <w:t>TestDBServer는 serverId 단위 작업 순서 보장을 위해 OrderedTaskQueue를 사용한다. 내부적으로 KeyedDispatcher를 래핑하여 같은 key(serverId)를 항상 같은 워커로 라우팅한다.</w:t>
+        <w:t>TestDBServer는 serverId 단위 작업 순서 보장을 위해 OrderedTaskQueue를 사용한다. 내부적으로 KeyedDispatcher를 래핑하여 같은 key(serverId)를 항상 같은 워커로 라우팅한다. 워커 수는 CLI -w 플래그로 설정 가능하며 기본값은 4(DEFAULT_DB_WORKER_COUNT)이다.</w:t>
       </w:r>
     </w:p>
     <w:p>
@@ -3622,7 +4537,7 @@
           <w:i w:val="0"/>
           <w:sz w:val="21"/>
         </w:rPr>
-        <w:t>facade: OrderedTaskQueue.cpp:29</w:t>
+        <w:t>facade: OrderedTaskQueue.cpp:Initialize()</w:t>
       </w:r>
     </w:p>
     <w:p>
@@ -3638,7 +4553,7 @@
           <w:i w:val="0"/>
           <w:sz w:val="21"/>
         </w:rPr>
-        <w:t>keyed dispatch: OrderedTaskQueue.cpp:109</w:t>
+        <w:t>keyed dispatch: OrderedTaskQueue.cpp:EnqueueTask()</w:t>
       </w:r>
     </w:p>
     <w:p>
@@ -3654,7 +4569,67 @@
           <w:i w:val="0"/>
           <w:sz w:val="21"/>
         </w:rPr>
-        <w:t>dispatcher 구현: Concurrency/KeyedDispatcher.h:30</w:t>
+        <w:t>dispatcher 구현: Concurrency/KeyedDispatcher.h</w:t>
+      </w:r>
+    </w:p>
+    <w:p>
+      <w:pPr>
+        <w:shd w:val="clear" w:color="auto" w:fill="F5F5F5"/>
+        <w:pBdr>
+          <w:left w:val="single" w:sz="6" w:space="4" w:color="90A4AE"/>
+        </w:pBdr>
+        <w:spacing w:before="40" w:after="40"/>
+        <w:ind w:left="340"/>
+      </w:pPr>
+      <w:r>
+        <w:rPr>
+          <w:rFonts w:ascii="Consolas" w:hAnsi="Consolas" w:eastAsia="Consolas"/>
+          <w:b/>
+          <w:i w:val="0"/>
+          <w:color w:val="37474F"/>
+          <w:sz w:val="19"/>
+        </w:rPr>
+        <w:t>NetworkTypes.h:DEFAULT_DB_WORKER_COUNT</w:t>
+      </w:r>
+      <w:r>
+        <w:rPr>
+          <w:rFonts w:ascii="맑은 고딕" w:hAnsi="맑은 고딕" w:eastAsia="맑은 고딕"/>
+          <w:b w:val="0"/>
+          <w:i w:val="0"/>
+          <w:color w:val="757575"/>
+          <w:sz w:val="18"/>
+        </w:rPr>
+        <w:t xml:space="preserve">  — 기본 워커 수 상수 (기본값 4)</w:t>
+      </w:r>
+    </w:p>
+    <w:p>
+      <w:pPr>
+        <w:shd w:val="clear" w:color="auto" w:fill="F5F5F5"/>
+        <w:pBdr>
+          <w:left w:val="single" w:sz="6" w:space="4" w:color="90A4AE"/>
+        </w:pBdr>
+        <w:spacing w:before="40" w:after="40"/>
+        <w:ind w:left="340"/>
+      </w:pPr>
+      <w:r>
+        <w:rPr>
+          <w:rFonts w:ascii="Consolas" w:hAnsi="Consolas" w:eastAsia="Consolas"/>
+          <w:b/>
+          <w:i w:val="0"/>
+          <w:color w:val="37474F"/>
+          <w:sz w:val="19"/>
+        </w:rPr>
+        <w:t>DBServer/main.cpp:-w 옵션</w:t>
+      </w:r>
+      <w:r>
+        <w:rPr>
+          <w:rFonts w:ascii="맑은 고딕" w:hAnsi="맑은 고딕" w:eastAsia="맑은 고딕"/>
+          <w:b w:val="0"/>
+          <w:i w:val="0"/>
+          <w:color w:val="757575"/>
+          <w:sz w:val="18"/>
+        </w:rPr>
+        <w:t xml:space="preserve">  — 런타임 워커 수 설정</w:t>
       </w:r>
     </w:p>
     <w:p>
@@ -6685,6 +7660,54 @@
     </w:p>
     <w:p>
       <w:pPr>
+        <w:pStyle w:val="ListBullet"/>
+        <w:spacing w:after="40"/>
+        <w:ind w:left="283"/>
+      </w:pPr>
+      <w:r>
+        <w:rPr>
+          <w:rFonts w:ascii="맑은 고딕" w:hAnsi="맑은 고딕" w:eastAsia="맑은 고딕"/>
+          <w:b w:val="0"/>
+          <w:i w:val="0"/>
+          <w:sz w:val="21"/>
+        </w:rPr>
+        <w:t>ProcessErrorCompletion 단일 헬퍼로 3-플랫폼 에러 처리 통합 — Send/Recv 방향 구분, 통계 분리</w:t>
+      </w:r>
+    </w:p>
+    <w:p>
+      <w:pPr>
+        <w:pStyle w:val="ListBullet"/>
+        <w:spacing w:after="40"/>
+        <w:ind w:left="283"/>
+      </w:pPr>
+      <w:r>
+        <w:rPr>
+          <w:rFonts w:ascii="맑은 고딕" w:hAnsi="맑은 고딕" w:eastAsia="맑은 고딕"/>
+          <w:b w:val="0"/>
+          <w:i w:val="0"/>
+          <w:sz w:val="21"/>
+        </w:rPr>
+        <w:t>SendResult::InvalidArgument 추가 — 재시도 불가 에러와 재시도 가능 에러(QueueFull) 명시적 구분</w:t>
+      </w:r>
+    </w:p>
+    <w:p>
+      <w:pPr>
+        <w:pStyle w:val="ListBullet"/>
+        <w:spacing w:after="40"/>
+        <w:ind w:left="283"/>
+      </w:pPr>
+      <w:r>
+        <w:rPr>
+          <w:rFonts w:ascii="맑은 고딕" w:hAnsi="맑은 고딕" w:eastAsia="맑은 고딕"/>
+          <w:b w:val="0"/>
+          <w:i w:val="0"/>
+          <w:sz w:val="21"/>
+        </w:rPr>
+        <w:t>DB 워커 수 config화(-w CLI, DEFAULT_DB_WORKER_COUNT / DEFAULT_TASK_QUEUE_WORKER_COUNT) — 매직넘버 제거</w:t>
+      </w:r>
+    </w:p>
+    <w:p>
+      <w:pPr>
         <w:pBdr>
           <w:left w:val="single" w:sz="12" w:space="4" w:color="1565C0"/>
         </w:pBdr>
@@ -6804,7 +7827,7 @@
         </w:tc>
         <w:tc>
           <w:tcPr>
-            <w:tcW w:type="dxa" w:w="4535"/>
+            <w:tcW w:type="dxa" w:w="5102"/>
             <w:shd w:val="clear" w:color="auto" w:fill="1A237E"/>
             <w:vAlign w:val="center"/>
           </w:tcPr>
@@ -6824,7 +7847,7 @@
         </w:tc>
         <w:tc>
           <w:tcPr>
-            <w:tcW w:type="dxa" w:w="4252"/>
+            <w:tcW w:type="dxa" w:w="3685"/>
             <w:shd w:val="clear" w:color="auto" w:fill="1A237E"/>
             <w:vAlign w:val="center"/>
           </w:tcPr>
@@ -6864,7 +7887,7 @@
         </w:tc>
         <w:tc>
           <w:tcPr>
-            <w:tcW w:type="dxa" w:w="4535"/>
+            <w:tcW w:type="dxa" w:w="5102"/>
             <w:vAlign w:val="center"/>
           </w:tcPr>
           <w:p>
@@ -6878,13 +7901,13 @@
               </w:rPr>
               <w:t>TestDBServer에 설정 기반 DB 주입 경로 추가</w:t>
               <w:br/>
-              <w:t>(main 옵션으로 연결)</w:t>
+              <w:t>(main -d 옵션 → ServerLatencyManager::SetDatabase())</w:t>
             </w:r>
           </w:p>
         </w:tc>
         <w:tc>
           <w:tcPr>
-            <w:tcW w:type="dxa" w:w="4252"/>
+            <w:tcW w:type="dxa" w:w="3685"/>
             <w:vAlign w:val="center"/>
           </w:tcPr>
           <w:p>
@@ -6919,13 +7942,13 @@
                 <w:i w:val="0"/>
                 <w:sz w:val="19"/>
               </w:rPr>
-              <w:t>High</w:t>
+              <w:t>Medium</w:t>
             </w:r>
           </w:p>
         </w:tc>
         <w:tc>
           <w:tcPr>
-            <w:tcW w:type="dxa" w:w="4535"/>
+            <w:tcW w:type="dxa" w:w="5102"/>
             <w:shd w:val="clear" w:color="auto" w:fill="F5F5F5"/>
             <w:vAlign w:val="center"/>
           </w:tcPr>
@@ -6938,15 +7961,15 @@
                 <w:i w:val="0"/>
                 <w:sz w:val="19"/>
               </w:rPr>
-              <w:t>포트 기본값(8001/8002) 정책 단일화</w:t>
+              <w:t>TestServer DB 서버 연결 경로를</w:t>
               <w:br/>
-              <w:t>(코드·스크립트·문서 일관)</w:t>
+              <w:t>플랫폼 공통 AsyncIO로 통합</w:t>
             </w:r>
           </w:p>
         </w:tc>
         <w:tc>
           <w:tcPr>
-            <w:tcW w:type="dxa" w:w="4252"/>
+            <w:tcW w:type="dxa" w:w="3685"/>
             <w:shd w:val="clear" w:color="auto" w:fill="F5F5F5"/>
             <w:vAlign w:val="center"/>
           </w:tcPr>
@@ -6959,7 +7982,7 @@
                 <w:i w:val="0"/>
                 <w:sz w:val="19"/>
               </w:rPr>
-              <w:t>배포 혼동 방지</w:t>
+              <w:t>Linux/macOS 지원 확대 (현재 Windows 전용)</w:t>
             </w:r>
           </w:p>
         </w:tc>
@@ -6979,13 +8002,13 @@
                 <w:i w:val="0"/>
                 <w:sz w:val="19"/>
               </w:rPr>
-              <w:t>Medium</w:t>
+              <w:t>Low</w:t>
             </w:r>
           </w:p>
         </w:tc>
         <w:tc>
           <w:tcPr>
-            <w:tcW w:type="dxa" w:w="4535"/>
+            <w:tcW w:type="dxa" w:w="5102"/>
             <w:vAlign w:val="center"/>
           </w:tcPr>
           <w:p>
@@ -6997,15 +8020,15 @@
                 <w:i w:val="0"/>
                 <w:sz w:val="19"/>
               </w:rPr>
-              <w:t>TestServer DB 서버 연결 경로를</w:t>
+              <w:t>운영 문서에</w:t>
               <w:br/>
-              <w:t>플랫폼 공통 AsyncIO로 통합</w:t>
+              <w:t>TestDBServer vs DBServer.cpp 경로 명시</w:t>
             </w:r>
           </w:p>
         </w:tc>
         <w:tc>
           <w:tcPr>
-            <w:tcW w:type="dxa" w:w="4252"/>
+            <w:tcW w:type="dxa" w:w="3685"/>
             <w:vAlign w:val="center"/>
           </w:tcPr>
           <w:p>
@@ -7017,7 +8040,7 @@
                 <w:i w:val="0"/>
                 <w:sz w:val="19"/>
               </w:rPr>
-              <w:t>Linux/macOS 지원 확대</w:t>
+              <w:t>신규 팀원 혼동 방지</w:t>
             </w:r>
           </w:p>
         </w:tc>
@@ -7038,13 +8061,13 @@
                 <w:i w:val="0"/>
                 <w:sz w:val="19"/>
               </w:rPr>
-              <w:t>Low</w:t>
+              <w:t>완료</w:t>
             </w:r>
           </w:p>
         </w:tc>
         <w:tc>
           <w:tcPr>
-            <w:tcW w:type="dxa" w:w="4535"/>
+            <w:tcW w:type="dxa" w:w="5102"/>
             <w:shd w:val="clear" w:color="auto" w:fill="F5F5F5"/>
             <w:vAlign w:val="center"/>
           </w:tcPr>
@@ -7057,15 +8080,15 @@
                 <w:i w:val="0"/>
                 <w:sz w:val="19"/>
               </w:rPr>
-              <w:t>운영 문서에</w:t>
+              <w:t>DB 워커 수 config화 (-w CLI, 상수 정의)</w:t>
               <w:br/>
-              <w:t>TestDBServer vs DBServer.cpp 경로 명시</w:t>
+              <w:t>(DBServer 기본 4, TestServer 기본 1)</w:t>
             </w:r>
           </w:p>
         </w:tc>
         <w:tc>
           <w:tcPr>
-            <w:tcW w:type="dxa" w:w="4252"/>
+            <w:tcW w:type="dxa" w:w="3685"/>
             <w:shd w:val="clear" w:color="auto" w:fill="F5F5F5"/>
             <w:vAlign w:val="center"/>
           </w:tcPr>
@@ -7078,7 +8101,69 @@
                 <w:i w:val="0"/>
                 <w:sz w:val="19"/>
               </w:rPr>
-              <w:t>신규 팀원 혼동 방지</w:t>
+              <w:t>매직넘버 제거</w:t>
+              <w:br/>
+              <w:t>런타임 설정 가능</w:t>
+            </w:r>
+          </w:p>
+        </w:tc>
+      </w:tr>
+      <w:tr>
+        <w:tc>
+          <w:tcPr>
+            <w:tcW w:type="dxa" w:w="1417"/>
+            <w:vAlign w:val="center"/>
+          </w:tcPr>
+          <w:p>
+            <w:r/>
+            <w:r>
+              <w:rPr>
+                <w:rFonts w:ascii="맑은 고딕" w:hAnsi="맑은 고딕" w:eastAsia="맑은 고딕"/>
+                <w:b w:val="0"/>
+                <w:i w:val="0"/>
+                <w:sz w:val="19"/>
+              </w:rPr>
+              <w:t>완료</w:t>
+            </w:r>
+          </w:p>
+        </w:tc>
+        <w:tc>
+          <w:tcPr>
+            <w:tcW w:type="dxa" w:w="5102"/>
+            <w:vAlign w:val="center"/>
+          </w:tcPr>
+          <w:p>
+            <w:r/>
+            <w:r>
+              <w:rPr>
+                <w:rFonts w:ascii="맑은 고딕" w:hAnsi="맑은 고딕" w:eastAsia="맑은 고딕"/>
+                <w:b w:val="0"/>
+                <w:i w:val="0"/>
+                <w:sz w:val="19"/>
+              </w:rPr>
+              <w:t>3-플랫폼 에러 처리 통합</w:t>
+              <w:br/>
+              <w:t>(ProcessErrorCompletion, 방향별 통계)</w:t>
+            </w:r>
+          </w:p>
+        </w:tc>
+        <w:tc>
+          <w:tcPr>
+            <w:tcW w:type="dxa" w:w="3685"/>
+            <w:vAlign w:val="center"/>
+          </w:tcPr>
+          <w:p>
+            <w:r/>
+            <w:r>
+              <w:rPr>
+                <w:rFonts w:ascii="맑은 고딕" w:hAnsi="맑은 고딕" w:eastAsia="맑은 고딕"/>
+                <w:b w:val="0"/>
+                <w:i w:val="0"/>
+                <w:sz w:val="19"/>
+              </w:rPr>
+              <w:t>플랫폼 간 동작 일관성 보장</w:t>
+              <w:br/>
+              <w:t>Send/Recv 에러 가시성 향상</w:t>
             </w:r>
           </w:p>
         </w:tc>
@@ -7289,6 +8374,36 @@
           <w:sz w:val="26"/>
         </w:rPr>
         <w:t>비동기 / 동시성 계층</w:t>
+      </w:r>
+    </w:p>
+    <w:p>
+      <w:pPr>
+        <w:shd w:val="clear" w:color="auto" w:fill="F5F5F5"/>
+        <w:pBdr>
+          <w:left w:val="single" w:sz="6" w:space="4" w:color="90A4AE"/>
+        </w:pBdr>
+        <w:spacing w:before="40" w:after="40"/>
+        <w:ind w:left="340"/>
+      </w:pPr>
+      <w:r>
+        <w:rPr>
+          <w:rFonts w:ascii="Consolas" w:hAnsi="Consolas" w:eastAsia="Consolas"/>
+          <w:b/>
+          <w:i w:val="0"/>
+          <w:color w:val="37474F"/>
+          <w:sz w:val="19"/>
+        </w:rPr>
+        <w:t>Server/ServerEngine/Utils/NetworkTypes.h</w:t>
+      </w:r>
+      <w:r>
+        <w:rPr>
+          <w:rFonts w:ascii="맑은 고딕" w:hAnsi="맑은 고딕" w:eastAsia="맑은 고딕"/>
+          <w:b w:val="0"/>
+          <w:i w:val="0"/>
+          <w:color w:val="757575"/>
+          <w:sz w:val="18"/>
+        </w:rPr>
+        <w:t xml:space="preserve">  — DEFAULT_DB_WORKER_COUNT / DEFAULT_TASK_QUEUE_WORKER_COUNT</w:t>
       </w:r>
     </w:p>
     <w:p>

</xml_diff>

<commit_message>
docs: v1.3 — code cleanup 반영 (unused code 제거, 주석 정리)
Co-Authored-By: Claude Sonnet 4.6 <noreply@anthropic.com>
</commit_message>
<xml_diff>
--- a/NetworkModuleTest/Doc/Reports/Network_Async_DB_Report.docx
+++ b/NetworkModuleTest/Doc/Reports/Network_Async_DB_Report.docx
@@ -198,7 +198,7 @@
           <w:color w:val="FFFFFF"/>
           <w:sz w:val="22"/>
         </w:rPr>
-        <w:t>1.2</w:t>
+        <w:t>1.3</w:t>
       </w:r>
     </w:p>
     <w:p>
@@ -347,13 +347,11 @@
                 <w:i w:val="0"/>
                 <w:sz w:val="19"/>
               </w:rPr>
-              <w:t>에러 처리 3-플랫폼 통합(ProcessErrorCompletion), SendResult::InvalidArgument 추가,</w:t>
+              <w:t>코드 정리(v1.3): 미구현 DBTaskType enum 제거(SaveGameProgress·Custom),</w:t>
               <w:br/>
-              <w:t>방향별 에러 통계(totalSendErrors / totalRecvErrors) 분리,</w:t>
+              <w:t>미사용 include 제거(&lt;iostream&gt;·&lt;cstring&gt;),</w:t>
               <w:br/>
-              <w:t>DB 워커 수 config화(-w CLI, DEFAULT_DB_WORKER_COUNT / DEFAULT_TASK_QUEUE_WORKER_COUNT),</w:t>
-              <w:br/>
-              <w:t>DBTaskQueue.cpp 포맷 정리, Session::Reset() assert, SessionManager 이중 close 방지</w:t>
+              <w:t>Shutdown() 불필요 mutex 제거, 이중 언어 주석 영어 단일화(119파일 −2,180줄)</w:t>
             </w:r>
           </w:p>
         </w:tc>
@@ -374,6 +372,51 @@
                 <w:i w:val="0"/>
                 <w:sz w:val="19"/>
               </w:rPr>
+              <w:t>2026-03-15</w:t>
+            </w:r>
+          </w:p>
+        </w:tc>
+        <w:tc>
+          <w:tcPr>
+            <w:tcW w:type="dxa" w:w="8504"/>
+            <w:shd w:val="clear" w:color="auto" w:fill="F5F5F5"/>
+            <w:vAlign w:val="center"/>
+          </w:tcPr>
+          <w:p>
+            <w:r/>
+            <w:r>
+              <w:rPr>
+                <w:rFonts w:ascii="맑은 고딕" w:hAnsi="맑은 고딕" w:eastAsia="맑은 고딕"/>
+                <w:b w:val="0"/>
+                <w:i w:val="0"/>
+                <w:sz w:val="19"/>
+              </w:rPr>
+              <w:t>에러 처리 3-플랫폼 통합(ProcessErrorCompletion), SendResult::InvalidArgument 추가,</w:t>
+              <w:br/>
+              <w:t>방향별 에러 통계(totalSendErrors / totalRecvErrors) 분리,</w:t>
+              <w:br/>
+              <w:t>DB 워커 수 config화(-w CLI, DEFAULT_DB_WORKER_COUNT / DEFAULT_TASK_QUEUE_WORKER_COUNT),</w:t>
+              <w:br/>
+              <w:t>DBTaskQueue.cpp 포맷 정리, Session::Reset() assert, SessionManager 이중 close 방지</w:t>
+            </w:r>
+          </w:p>
+        </w:tc>
+      </w:tr>
+      <w:tr>
+        <w:tc>
+          <w:tcPr>
+            <w:tcW w:type="dxa" w:w="1701"/>
+            <w:vAlign w:val="center"/>
+          </w:tcPr>
+          <w:p>
+            <w:r/>
+            <w:r>
+              <w:rPr>
+                <w:rFonts w:ascii="맑은 고딕" w:hAnsi="맑은 고딕" w:eastAsia="맑은 고딕"/>
+                <w:b w:val="0"/>
+                <w:i w:val="0"/>
+                <w:sz w:val="19"/>
+              </w:rPr>
               <w:t>2026-03-10</w:t>
             </w:r>
           </w:p>
@@ -381,7 +424,6 @@
         <w:tc>
           <w:tcPr>
             <w:tcW w:type="dxa" w:w="8504"/>
-            <w:shd w:val="clear" w:color="auto" w:fill="F5F5F5"/>
             <w:vAlign w:val="center"/>
           </w:tcPr>
           <w:p>
@@ -404,6 +446,7 @@
         <w:tc>
           <w:tcPr>
             <w:tcW w:type="dxa" w:w="1701"/>
+            <w:shd w:val="clear" w:color="auto" w:fill="F5F5F5"/>
             <w:vAlign w:val="center"/>
           </w:tcPr>
           <w:p>
@@ -422,6 +465,7 @@
         <w:tc>
           <w:tcPr>
             <w:tcW w:type="dxa" w:w="8504"/>
+            <w:shd w:val="clear" w:color="auto" w:fill="F5F5F5"/>
             <w:vAlign w:val="center"/>
           </w:tcPr>
           <w:p>
@@ -442,7 +486,6 @@
         <w:tc>
           <w:tcPr>
             <w:tcW w:type="dxa" w:w="1701"/>
-            <w:shd w:val="clear" w:color="auto" w:fill="F5F5F5"/>
             <w:vAlign w:val="center"/>
           </w:tcPr>
           <w:p>
@@ -461,7 +504,6 @@
         <w:tc>
           <w:tcPr>
             <w:tcW w:type="dxa" w:w="8504"/>
-            <w:shd w:val="clear" w:color="auto" w:fill="F5F5F5"/>
             <w:vAlign w:val="center"/>
           </w:tcPr>
           <w:p>
@@ -482,6 +524,7 @@
         <w:tc>
           <w:tcPr>
             <w:tcW w:type="dxa" w:w="1701"/>
+            <w:shd w:val="clear" w:color="auto" w:fill="F5F5F5"/>
             <w:vAlign w:val="center"/>
           </w:tcPr>
           <w:p>
@@ -500,6 +543,7 @@
         <w:tc>
           <w:tcPr>
             <w:tcW w:type="dxa" w:w="8504"/>
+            <w:shd w:val="clear" w:color="auto" w:fill="F5F5F5"/>
             <w:vAlign w:val="center"/>
           </w:tcPr>
           <w:p>
@@ -520,7 +564,6 @@
         <w:tc>
           <w:tcPr>
             <w:tcW w:type="dxa" w:w="1701"/>
-            <w:shd w:val="clear" w:color="auto" w:fill="F5F5F5"/>
             <w:vAlign w:val="center"/>
           </w:tcPr>
           <w:p>
@@ -539,7 +582,6 @@
         <w:tc>
           <w:tcPr>
             <w:tcW w:type="dxa" w:w="8504"/>
-            <w:shd w:val="clear" w:color="auto" w:fill="F5F5F5"/>
             <w:vAlign w:val="center"/>
           </w:tcPr>
           <w:p>

</xml_diff>

<commit_message>
docs: v1.4 — ExecutionQueue 단순화 반영, draw.io 다이어그램 전면 갱신
Co-Authored-By: Claude Sonnet 4.6 <noreply@anthropic.com>
</commit_message>
<xml_diff>
--- a/NetworkModuleTest/Doc/Reports/Network_Async_DB_Report.docx
+++ b/NetworkModuleTest/Doc/Reports/Network_Async_DB_Report.docx
@@ -198,7 +198,7 @@
           <w:color w:val="FFFFFF"/>
           <w:sz w:val="22"/>
         </w:rPr>
-        <w:t>1.3</w:t>
+        <w:t>1.4</w:t>
       </w:r>
     </w:p>
     <w:p>
@@ -347,11 +347,11 @@
                 <w:i w:val="0"/>
                 <w:sz w:val="19"/>
               </w:rPr>
-              <w:t>코드 정리(v1.3): 미구현 DBTaskType enum 제거(SaveGameProgress·Custom),</w:t>
+              <w:t>단순화(v1.4): ExecutionQueue lock-free 백엔드 제거, BoundedLockFreeQueue 삭제,</w:t>
               <w:br/>
-              <w:t>미사용 include 제거(&lt;iostream&gt;·&lt;cstring&gt;),</w:t>
+              <w:t>mutex 단일 백엔드로 통일 (533→157줄). draw.io 다이어그램 전면 갱신,</w:t>
               <w:br/>
-              <w:t>Shutdown() 불필요 mutex 제거, 이중 언어 주석 영어 단일화(119파일 −2,180줄)</w:t>
+              <w:t>03/04 시퀀스 다이어그램 draw.io 소스 추가.</w:t>
             </w:r>
           </w:p>
         </w:tc>
@@ -391,13 +391,11 @@
                 <w:i w:val="0"/>
                 <w:sz w:val="19"/>
               </w:rPr>
-              <w:t>에러 처리 3-플랫폼 통합(ProcessErrorCompletion), SendResult::InvalidArgument 추가,</w:t>
+              <w:t>코드 정리(v1.3): 미구현 DBTaskType enum 제거(SaveGameProgress·Custom),</w:t>
               <w:br/>
-              <w:t>방향별 에러 통계(totalSendErrors / totalRecvErrors) 분리,</w:t>
+              <w:t>미사용 include 제거(&lt;iostream&gt;·&lt;cstring&gt;),</w:t>
               <w:br/>
-              <w:t>DB 워커 수 config화(-w CLI, DEFAULT_DB_WORKER_COUNT / DEFAULT_TASK_QUEUE_WORKER_COUNT),</w:t>
-              <w:br/>
-              <w:t>DBTaskQueue.cpp 포맷 정리, Session::Reset() assert, SessionManager 이중 close 방지</w:t>
+              <w:t>Shutdown() 불필요 mutex 제거, 이중 언어 주석 영어 단일화(119파일 −2,180줄)</w:t>
             </w:r>
           </w:p>
         </w:tc>
@@ -417,6 +415,51 @@
                 <w:i w:val="0"/>
                 <w:sz w:val="19"/>
               </w:rPr>
+              <w:t>2026-03-15</w:t>
+            </w:r>
+          </w:p>
+        </w:tc>
+        <w:tc>
+          <w:tcPr>
+            <w:tcW w:type="dxa" w:w="8504"/>
+            <w:vAlign w:val="center"/>
+          </w:tcPr>
+          <w:p>
+            <w:r/>
+            <w:r>
+              <w:rPr>
+                <w:rFonts w:ascii="맑은 고딕" w:hAnsi="맑은 고딕" w:eastAsia="맑은 고딕"/>
+                <w:b w:val="0"/>
+                <w:i w:val="0"/>
+                <w:sz w:val="19"/>
+              </w:rPr>
+              <w:t>에러 처리 3-플랫폼 통합(ProcessErrorCompletion), SendResult::InvalidArgument 추가,</w:t>
+              <w:br/>
+              <w:t>방향별 에러 통계(totalSendErrors / totalRecvErrors) 분리,</w:t>
+              <w:br/>
+              <w:t>DB 워커 수 config화(-w CLI, DEFAULT_DB_WORKER_COUNT / DEFAULT_TASK_QUEUE_WORKER_COUNT),</w:t>
+              <w:br/>
+              <w:t>DBTaskQueue.cpp 포맷 정리, Session::Reset() assert, SessionManager 이중 close 방지</w:t>
+            </w:r>
+          </w:p>
+        </w:tc>
+      </w:tr>
+      <w:tr>
+        <w:tc>
+          <w:tcPr>
+            <w:tcW w:type="dxa" w:w="1701"/>
+            <w:shd w:val="clear" w:color="auto" w:fill="F5F5F5"/>
+            <w:vAlign w:val="center"/>
+          </w:tcPr>
+          <w:p>
+            <w:r/>
+            <w:r>
+              <w:rPr>
+                <w:rFonts w:ascii="맑은 고딕" w:hAnsi="맑은 고딕" w:eastAsia="맑은 고딕"/>
+                <w:b w:val="0"/>
+                <w:i w:val="0"/>
+                <w:sz w:val="19"/>
+              </w:rPr>
               <w:t>2026-03-10</w:t>
             </w:r>
           </w:p>
@@ -424,6 +467,7 @@
         <w:tc>
           <w:tcPr>
             <w:tcW w:type="dxa" w:w="8504"/>
+            <w:shd w:val="clear" w:color="auto" w:fill="F5F5F5"/>
             <w:vAlign w:val="center"/>
           </w:tcPr>
           <w:p>
@@ -446,7 +490,6 @@
         <w:tc>
           <w:tcPr>
             <w:tcW w:type="dxa" w:w="1701"/>
-            <w:shd w:val="clear" w:color="auto" w:fill="F5F5F5"/>
             <w:vAlign w:val="center"/>
           </w:tcPr>
           <w:p>
@@ -465,7 +508,6 @@
         <w:tc>
           <w:tcPr>
             <w:tcW w:type="dxa" w:w="8504"/>
-            <w:shd w:val="clear" w:color="auto" w:fill="F5F5F5"/>
             <w:vAlign w:val="center"/>
           </w:tcPr>
           <w:p>
@@ -486,6 +528,7 @@
         <w:tc>
           <w:tcPr>
             <w:tcW w:type="dxa" w:w="1701"/>
+            <w:shd w:val="clear" w:color="auto" w:fill="F5F5F5"/>
             <w:vAlign w:val="center"/>
           </w:tcPr>
           <w:p>
@@ -504,6 +547,7 @@
         <w:tc>
           <w:tcPr>
             <w:tcW w:type="dxa" w:w="8504"/>
+            <w:shd w:val="clear" w:color="auto" w:fill="F5F5F5"/>
             <w:vAlign w:val="center"/>
           </w:tcPr>
           <w:p>
@@ -524,7 +568,6 @@
         <w:tc>
           <w:tcPr>
             <w:tcW w:type="dxa" w:w="1701"/>
-            <w:shd w:val="clear" w:color="auto" w:fill="F5F5F5"/>
             <w:vAlign w:val="center"/>
           </w:tcPr>
           <w:p>
@@ -543,7 +586,6 @@
         <w:tc>
           <w:tcPr>
             <w:tcW w:type="dxa" w:w="8504"/>
-            <w:shd w:val="clear" w:color="auto" w:fill="F5F5F5"/>
             <w:vAlign w:val="center"/>
           </w:tcPr>
           <w:p>
@@ -564,6 +606,7 @@
         <w:tc>
           <w:tcPr>
             <w:tcW w:type="dxa" w:w="1701"/>
+            <w:shd w:val="clear" w:color="auto" w:fill="F5F5F5"/>
             <w:vAlign w:val="center"/>
           </w:tcPr>
           <w:p>
@@ -582,6 +625,7 @@
         <w:tc>
           <w:tcPr>
             <w:tcW w:type="dxa" w:w="8504"/>
+            <w:shd w:val="clear" w:color="auto" w:fill="F5F5F5"/>
             <w:vAlign w:val="center"/>
           </w:tcPr>
           <w:p>
@@ -4529,7 +4573,7 @@
           <w:color w:val="616161"/>
           <w:sz w:val="18"/>
         </w:rPr>
-        <w:t>▲  ExecutionQueue 이중 백엔드 — Mutex / Lock-Free (draw.io)</w:t>
+        <w:t>▲  ExecutionQueue — Mutex 단일 백엔드 (draw.io)</w:t>
       </w:r>
     </w:p>
     <w:p>

</xml_diff>

<commit_message>
docs: Sec03 dispatch flow 다중 DB Worker 구조 반영 + 캡션 (draw.io) 제거
- Sec03 drawio: DB Worker 1·2 박스 추가, Logic Worker 1·2 → DBTaskQueue
  dashed 화살표, DBTaskQueue → DB Worker 1·2 라우팅 화살표 추가
  (sessionId % N → DB Worker 배정 구조로 다이어그램 현행화)
- Build-NetworkAsyncDB-Report.py: 모든 image_drawio() 캡션에서
  ' (draw.io)' 텍스트 제거 (draw.io 소스 파일은 유지)
- assets/diag_async_1_dispatch.png 재생성
- 중복 파일(복사본.docx) 삭제

Co-Authored-By: Claude Sonnet 4.6 <noreply@anthropic.com>
</commit_message>
<xml_diff>
--- a/NetworkModuleTest/Doc/Reports/Network_Async_DB_Report.docx
+++ b/NetworkModuleTest/Doc/Reports/Network_Async_DB_Report.docx
@@ -794,7 +794,7 @@
           <w:color w:val="616161"/>
           <w:sz w:val="18"/>
         </w:rPr>
-        <w:t>▲  아키텍처 계층 구조 (draw.io)</w:t>
+        <w:t>▲  아키텍처 계층 구조</w:t>
       </w:r>
     </w:p>
     <w:p>
@@ -2038,7 +2038,7 @@
           <w:color w:val="616161"/>
           <w:sz w:val="18"/>
         </w:rPr>
-        <w:t>▲  연결 수립 시퀀스 (draw.io)</w:t>
+        <w:t>▲  연결 수립 시퀀스</w:t>
       </w:r>
     </w:p>
     <w:p>
@@ -3483,7 +3483,7 @@
           <w:color w:val="616161"/>
           <w:sz w:val="18"/>
         </w:rPr>
-        <w:t>▲  I/O 완료 → 워커 배정 흐름 (draw.io)</w:t>
+        <w:t>▲  I/O 완료 → 워커 배정 흐름</w:t>
       </w:r>
     </w:p>
     <w:p>
@@ -4518,7 +4518,7 @@
           <w:color w:val="616161"/>
           <w:sz w:val="18"/>
         </w:rPr>
-        <w:t>▲  KeyedDispatcher 세션 라우팅 (draw.io)</w:t>
+        <w:t>▲  KeyedDispatcher 세션 라우팅</w:t>
       </w:r>
     </w:p>
     <w:p>
@@ -4573,7 +4573,7 @@
           <w:color w:val="616161"/>
           <w:sz w:val="18"/>
         </w:rPr>
-        <w:t>▲  ExecutionQueue — Mutex 단일 백엔드 (draw.io)</w:t>
+        <w:t>▲  ExecutionQueue — Mutex 단일 백엔드</w:t>
       </w:r>
     </w:p>
     <w:p>
@@ -5209,7 +5209,7 @@
           <w:color w:val="616161"/>
           <w:sz w:val="18"/>
         </w:rPr>
-        <w:t>▲  DB 처리 계층 — WAL · Factory · 비동기 큐 (draw.io)</w:t>
+        <w:t>▲  DB 처리 계층 — WAL · Factory · 비동기 큐</w:t>
       </w:r>
     </w:p>
     <w:p>

</xml_diff>